<commit_message>
Feat: Add MCQ answer sheet to TCD Word exam template
Problem:
The TCD LaTeX template includes a detachable MCQ answer sheet section
spanning pages 2-4 (candidate ID bubble matrix, instructions banner,
and 3-column answer bubble grid with duplex blank pages), but the Word
template (tcd-exam.docx) lacked an equivalent answer sheet.

Solution:
1. Compute candidate_info and balanced 3-column answer_sheet_rows in
   _prepare_context_for_docx, formatting open bubbles (Ⓐ Ⓑ Ⓒ, Ⓣ Ⓕ)
   for student mode and filled bubbles (🅐 🅑 Ⓒ, 🅣 Ⓕ) for solutions mode.
2. Insert duplex blank pages ("This page was intentionally left blank.")
   and the complete Answer Sheet section between the Cover Page and the
   questions loop in create_tcd_docx_template.py.
3. Regenerate tcd-exam.docx and add automated tests in test_docx_export.py.

Impact:
Word exam exports now include an institutional detachable answer sheet
matching LaTeX exam papers for both standard and midterm exams.
</commit_message>
<xml_diff>
--- a/src/quizml/templates/tcd-exam.docx
+++ b/src/quizml/templates/tcd-exam.docx
@@ -633,6 +633,372 @@
           <w:sz w:val="24"/>
           <w:szCs w:val="24"/>
         </w:rPr>
+        <w:br w:type="page"/>
+      </w:r>
+    </w:p>
+    <w:p>
+      <w:pPr>
+        <w:spacing w:before="5000"/>
+        <w:jc w:val="center"/>
+      </w:pPr>
+      <w:r>
+        <w:rPr>
+          <w:rFonts w:ascii="Calibri" w:hAnsi="Calibri"/>
+          <w:i/>
+          <w:sz w:val="24"/>
+        </w:rPr>
+        <w:t>This page was intentionally left blank.</w:t>
+      </w:r>
+    </w:p>
+    <w:p>
+      <w:r>
+        <w:br w:type="page"/>
+      </w:r>
+    </w:p>
+    <w:tbl>
+      <w:tblPr>
+        <w:tblW w:type="auto" w:w="0"/>
+        <w:tblLook w:firstColumn="1" w:firstRow="1" w:lastColumn="0" w:lastRow="0" w:noHBand="0" w:noVBand="1" w:val="04A0"/>
+        <w:tblBorders>
+          <w:top w:val="none"/>
+          <w:left w:val="none"/>
+          <w:bottom w:val="none"/>
+          <w:right w:val="none"/>
+          <w:insideH w:val="none"/>
+          <w:insideV w:val="none"/>
+        </w:tblBorders>
+      </w:tblPr>
+      <w:tblGrid>
+        <w:gridCol w:w="4595"/>
+        <w:gridCol w:w="4595"/>
+      </w:tblGrid>
+      <w:tr>
+        <w:tc>
+          <w:tcPr>
+            <w:tcW w:type="dxa" w:w="5184"/>
+          </w:tcPr>
+          <w:p>
+            <w:pPr>
+              <w:spacing w:before="80" w:after="280"/>
+            </w:pPr>
+            <w:r>
+              <w:rPr>
+                <w:rFonts w:ascii="Calibri" w:hAnsi="Calibri"/>
+                <w:sz w:val="22"/>
+              </w:rPr>
+              <w:t>{{ candidate_info.line1_label }}:</w:t>
+              <w:tab/>
+            </w:r>
+            <w:r>
+              <w:rPr>
+                <w:rFonts w:ascii="Calibri" w:hAnsi="Calibri"/>
+                <w:sz w:val="22"/>
+              </w:rPr>
+              <w:t>________________________________</w:t>
+            </w:r>
+          </w:p>
+          <w:p>
+            <w:pPr>
+              <w:spacing w:before="0" w:after="80"/>
+            </w:pPr>
+            <w:r>
+              <w:rPr>
+                <w:rFonts w:ascii="Calibri" w:hAnsi="Calibri"/>
+                <w:sz w:val="22"/>
+              </w:rPr>
+              <w:t>{{ candidate_info.line2_label }}:</w:t>
+              <w:tab/>
+            </w:r>
+            <w:r>
+              <w:rPr>
+                <w:rFonts w:ascii="Calibri" w:hAnsi="Calibri"/>
+                <w:sz w:val="22"/>
+              </w:rPr>
+              <w:t>________________________________</w:t>
+            </w:r>
+          </w:p>
+        </w:tc>
+        <w:tc>
+          <w:tcPr>
+            <w:tcW w:type="dxa" w:w="4003"/>
+          </w:tcPr>
+          <w:p>
+            <w:pPr>
+              <w:spacing w:before="80" w:after="80"/>
+            </w:pPr>
+            <w:r>
+              <w:rPr>
+                <w:rFonts w:ascii="Calibri" w:hAnsi="Calibri"/>
+                <w:sz w:val="22"/>
+              </w:rPr>
+              <w:t>{{ candidate_info.mark_instruction }}</w:t>
+            </w:r>
+          </w:p>
+          <w:p>
+            <w:pPr>
+              <w:spacing w:before="0" w:after="80" w:line="276" w:lineRule="auto"/>
+            </w:pPr>
+            <w:r>
+              <w:rPr>
+                <w:rFonts w:ascii="Calibri" w:hAnsi="Calibri"/>
+                <w:sz w:val="20"/>
+              </w:rPr>
+              <w:t>{{ candidate_info.digit_rows }}</w:t>
+            </w:r>
+          </w:p>
+        </w:tc>
+      </w:tr>
+    </w:tbl>
+    <w:p>
+      <w:pPr>
+        <w:spacing w:before="280" w:after="80"/>
+      </w:pPr>
+      <w:r>
+        <w:rPr>
+          <w:rFonts w:ascii="Calibri" w:hAnsi="Calibri"/>
+          <w:b/>
+          <w:sz w:val="22"/>
+        </w:rPr>
+        <w:t>All your MCQ answers must be filled in on this answer page.</w:t>
+      </w:r>
+    </w:p>
+    <w:p>
+      <w:pPr>
+        <w:spacing w:before="0" w:after="240"/>
+      </w:pPr>
+      <w:r>
+        <w:rPr>
+          <w:rFonts w:ascii="Calibri" w:hAnsi="Calibri"/>
+          <w:sz w:val="21"/>
+        </w:rPr>
+        <w:t xml:space="preserve">For </w:t>
+      </w:r>
+      <w:r>
+        <w:rPr>
+          <w:rFonts w:ascii="Calibri" w:hAnsi="Calibri"/>
+          <w:b/>
+          <w:sz w:val="21"/>
+        </w:rPr>
+        <w:t>True</w:t>
+      </w:r>
+      <w:r>
+        <w:rPr>
+          <w:rFonts w:ascii="Calibri" w:hAnsi="Calibri"/>
+          <w:sz w:val="21"/>
+        </w:rPr>
+        <w:t xml:space="preserve"> or </w:t>
+      </w:r>
+      <w:r>
+        <w:rPr>
+          <w:rFonts w:ascii="Calibri" w:hAnsi="Calibri"/>
+          <w:b/>
+          <w:sz w:val="21"/>
+        </w:rPr>
+        <w:t>False</w:t>
+      </w:r>
+      <w:r>
+        <w:rPr>
+          <w:rFonts w:ascii="Calibri" w:hAnsi="Calibri"/>
+          <w:sz w:val="21"/>
+        </w:rPr>
+        <w:t xml:space="preserve"> questions, mark Ⓣ or Ⓕ. For questions with multiple choices, mark all solutions that are correct (for instance 🅐🅑Ⓒ🅓).</w:t>
+      </w:r>
+    </w:p>
+    <w:tbl>
+      <w:tblPr>
+        <w:tblW w:type="auto" w:w="0"/>
+        <w:tblLook w:firstColumn="1" w:firstRow="1" w:lastColumn="0" w:lastRow="0" w:noHBand="0" w:noVBand="1" w:val="04A0"/>
+        <w:tblBorders>
+          <w:top w:val="none"/>
+          <w:left w:val="none"/>
+          <w:bottom w:val="none"/>
+          <w:right w:val="none"/>
+          <w:insideH w:val="none"/>
+          <w:insideV w:val="none"/>
+        </w:tblBorders>
+      </w:tblPr>
+      <w:tblGrid>
+        <w:gridCol w:w="3063"/>
+        <w:gridCol w:w="3063"/>
+        <w:gridCol w:w="3063"/>
+      </w:tblGrid>
+      <w:tr>
+        <w:tc>
+          <w:tcPr>
+            <w:tcW w:type="dxa" w:w="3053"/>
+          </w:tcPr>
+          <w:p>
+            <w:r>
+              <w:t>{%tr for row in answer_sheet_rows %}</w:t>
+            </w:r>
+          </w:p>
+        </w:tc>
+        <w:tc>
+          <w:tcPr>
+            <w:tcW w:type="dxa" w:w="3053"/>
+          </w:tcPr>
+          <w:p/>
+        </w:tc>
+        <w:tc>
+          <w:tcPr>
+            <w:tcW w:type="dxa" w:w="3082"/>
+          </w:tcPr>
+          <w:p/>
+        </w:tc>
+      </w:tr>
+      <w:tr>
+        <w:tc>
+          <w:tcPr>
+            <w:tcW w:type="dxa" w:w="3053"/>
+          </w:tcPr>
+          <w:p>
+            <w:pPr>
+              <w:tabs>
+                <w:tab w:pos="576" w:val="left"/>
+              </w:tabs>
+              <w:spacing w:before="20" w:after="40" w:line="276" w:lineRule="auto"/>
+            </w:pPr>
+            <w:r>
+              <w:rPr>
+                <w:rFonts w:ascii="Calibri" w:hAnsi="Calibri"/>
+                <w:b/>
+                <w:sz w:val="21"/>
+              </w:rPr>
+              <w:t>{{ row.c1.num }}</w:t>
+            </w:r>
+            <w:r>
+              <w:rPr>
+                <w:rFonts w:ascii="Calibri" w:hAnsi="Calibri"/>
+                <w:sz w:val="21"/>
+              </w:rPr>
+              <w:t>{{ row.c1.sep }}</w:t>
+            </w:r>
+            <w:r>
+              <w:rPr>
+                <w:rFonts w:ascii="Calibri" w:hAnsi="Calibri"/>
+                <w:sz w:val="21"/>
+              </w:rPr>
+              <w:t>{{ row.c1.bubbles }}</w:t>
+            </w:r>
+          </w:p>
+        </w:tc>
+        <w:tc>
+          <w:tcPr>
+            <w:tcW w:type="dxa" w:w="3053"/>
+          </w:tcPr>
+          <w:p>
+            <w:pPr>
+              <w:tabs>
+                <w:tab w:pos="576" w:val="left"/>
+              </w:tabs>
+              <w:spacing w:before="20" w:after="40" w:line="276" w:lineRule="auto"/>
+            </w:pPr>
+            <w:r>
+              <w:rPr>
+                <w:rFonts w:ascii="Calibri" w:hAnsi="Calibri"/>
+                <w:b/>
+                <w:sz w:val="21"/>
+              </w:rPr>
+              <w:t>{{ row.c2.num }}</w:t>
+            </w:r>
+            <w:r>
+              <w:rPr>
+                <w:rFonts w:ascii="Calibri" w:hAnsi="Calibri"/>
+                <w:sz w:val="21"/>
+              </w:rPr>
+              <w:t>{{ row.c2.sep }}</w:t>
+            </w:r>
+            <w:r>
+              <w:rPr>
+                <w:rFonts w:ascii="Calibri" w:hAnsi="Calibri"/>
+                <w:sz w:val="21"/>
+              </w:rPr>
+              <w:t>{{ row.c2.bubbles }}</w:t>
+            </w:r>
+          </w:p>
+        </w:tc>
+        <w:tc>
+          <w:tcPr>
+            <w:tcW w:type="dxa" w:w="3082"/>
+          </w:tcPr>
+          <w:p>
+            <w:pPr>
+              <w:tabs>
+                <w:tab w:pos="576" w:val="left"/>
+              </w:tabs>
+              <w:spacing w:before="20" w:after="40" w:line="276" w:lineRule="auto"/>
+            </w:pPr>
+            <w:r>
+              <w:rPr>
+                <w:rFonts w:ascii="Calibri" w:hAnsi="Calibri"/>
+                <w:b/>
+                <w:sz w:val="21"/>
+              </w:rPr>
+              <w:t>{{ row.c3.num }}</w:t>
+            </w:r>
+            <w:r>
+              <w:rPr>
+                <w:rFonts w:ascii="Calibri" w:hAnsi="Calibri"/>
+                <w:sz w:val="21"/>
+              </w:rPr>
+              <w:t>{{ row.c3.sep }}</w:t>
+            </w:r>
+            <w:r>
+              <w:rPr>
+                <w:rFonts w:ascii="Calibri" w:hAnsi="Calibri"/>
+                <w:sz w:val="21"/>
+              </w:rPr>
+              <w:t>{{ row.c3.bubbles }}</w:t>
+            </w:r>
+          </w:p>
+        </w:tc>
+      </w:tr>
+      <w:tr>
+        <w:tc>
+          <w:tcPr>
+            <w:tcW w:type="dxa" w:w="3053"/>
+          </w:tcPr>
+          <w:p>
+            <w:r>
+              <w:t>{%tr endfor %}</w:t>
+            </w:r>
+          </w:p>
+        </w:tc>
+        <w:tc>
+          <w:tcPr>
+            <w:tcW w:type="dxa" w:w="3053"/>
+          </w:tcPr>
+          <w:p/>
+        </w:tc>
+        <w:tc>
+          <w:tcPr>
+            <w:tcW w:type="dxa" w:w="3082"/>
+          </w:tcPr>
+          <w:p/>
+        </w:tc>
+      </w:tr>
+    </w:tbl>
+    <w:p>
+      <w:r>
+        <w:br w:type="page"/>
+      </w:r>
+    </w:p>
+    <w:p>
+      <w:pPr>
+        <w:spacing w:before="5000"/>
+        <w:jc w:val="center"/>
+      </w:pPr>
+      <w:r>
+        <w:rPr>
+          <w:rFonts w:ascii="Calibri" w:hAnsi="Calibri"/>
+          <w:i/>
+          <w:sz w:val="24"/>
+        </w:rPr>
+        <w:t>This page was intentionally left blank.</w:t>
+      </w:r>
+    </w:p>
+    <w:p>
+      <w:r>
         <w:br w:type="page"/>
       </w:r>
     </w:p>

</xml_diff>